<commit_message>
icas schritt 4 und neufassug kapitel
</commit_message>
<xml_diff>
--- a/library/php/DataMining/NLP Normalisierung Tabelle/6.x Minimalinvasive Kalibrierung der FRZK-Vektordaten und Re-Validierung von Reihe 1.docx
+++ b/library/php/DataMining/NLP Normalisierung Tabelle/6.x Minimalinvasive Kalibrierung der FRZK-Vektordaten und Re-Validierung von Reihe 1.docx
@@ -326,8 +326,664 @@
       </w:r>
     </w:p>
     <w:p>
-      <w:r>
+      <w:pPr>
+        <w:rPr>
+          <w:b/>
+          <w:bCs/>
+        </w:rPr>
+      </w:pPr>
+      <w:r>
+        <w:rPr>
+          <w:b/>
+          <w:bCs/>
+        </w:rPr>
         <w:lastRenderedPageBreak/>
+        <w:t>5.4.1 Globale Kalibrierung der Funktionsklassen (Schritt 1)</w:t>
+      </w:r>
+    </w:p>
+    <w:p>
+      <w:r>
+        <w:t>Die initiale Kalibrierstrategie basierte auf der selektiven Anpassung einzelner Funktionsklassen. Die empirische Analyse der Differenzen zwischen der durch das System erzeugten Vektorstruktur (Reihe 1) und dem Referenzfeld der Reihen 8–16 zeigte jedoch, dass diese Vorgehensweise nicht hinreichend ist. Die Abweichungen treten nicht isoliert in einzelnen Dimensionen auf, sondern manifestieren sich als systematische Verschiebung im gesamten semantischen Raum.</w:t>
+      </w:r>
+    </w:p>
+    <w:p>
+      <w:r>
+        <w:t xml:space="preserve">Zur quantitativen Bestimmung dieser Verschiebung wurde für jeden Satz iii und jede Dimension </w:t>
+      </w:r>
+      <w:proofErr w:type="spellStart"/>
+      <w:r>
+        <w:t>jjj</w:t>
+      </w:r>
+      <w:proofErr w:type="spellEnd"/>
+      <w:r>
+        <w:t xml:space="preserve"> die Differenz</w:t>
+      </w:r>
+    </w:p>
+    <w:p>
+      <w:proofErr w:type="spellStart"/>
+      <w:r>
+        <w:t>Δi,j</w:t>
+      </w:r>
+      <w:proofErr w:type="spellEnd"/>
+      <w:r>
+        <w:t>=</w:t>
+      </w:r>
+      <w:proofErr w:type="spellStart"/>
+      <w:r>
+        <w:t>xi,jtarget−xi,j</w:t>
+      </w:r>
+      <w:proofErr w:type="spellEnd"/>
+      <w:r>
+        <w:t>(1)\Delta_{</w:t>
+      </w:r>
+      <w:proofErr w:type="spellStart"/>
+      <w:r>
+        <w:t>i,j</w:t>
+      </w:r>
+      <w:proofErr w:type="spellEnd"/>
+      <w:r>
+        <w:t>} = x^{</w:t>
+      </w:r>
+      <w:proofErr w:type="spellStart"/>
+      <w:r>
+        <w:t>target</w:t>
+      </w:r>
+      <w:proofErr w:type="spellEnd"/>
+      <w:r>
+        <w:t>}_{</w:t>
+      </w:r>
+      <w:proofErr w:type="spellStart"/>
+      <w:r>
+        <w:t>i,j</w:t>
+      </w:r>
+      <w:proofErr w:type="spellEnd"/>
+      <w:r>
+        <w:t>} - x^{(1)}_{</w:t>
+      </w:r>
+      <w:proofErr w:type="spellStart"/>
+      <w:r>
+        <w:t>i,j</w:t>
+      </w:r>
+      <w:proofErr w:type="spellEnd"/>
+      <w:r>
+        <w:t>}</w:t>
+      </w:r>
+      <w:proofErr w:type="spellStart"/>
+      <w:r>
+        <w:t>Δi,j</w:t>
+      </w:r>
+      <w:proofErr w:type="spellEnd"/>
+      <w:r>
+        <w:t>​=</w:t>
+      </w:r>
+      <w:proofErr w:type="spellStart"/>
+      <w:r>
+        <w:t>xi,jtarget</w:t>
+      </w:r>
+      <w:proofErr w:type="spellEnd"/>
+      <w:r>
+        <w:t>​−</w:t>
+      </w:r>
+      <w:proofErr w:type="spellStart"/>
+      <w:r>
+        <w:t>xi,j</w:t>
+      </w:r>
+      <w:proofErr w:type="spellEnd"/>
+      <w:r>
+        <w:t xml:space="preserve">(1)​ </w:t>
+      </w:r>
+    </w:p>
+    <w:p>
+      <w:r>
+        <w:t xml:space="preserve">gebildet, wobei </w:t>
+      </w:r>
+      <w:proofErr w:type="spellStart"/>
+      <w:r>
+        <w:t>xi,jtargetx</w:t>
+      </w:r>
+      <w:proofErr w:type="spellEnd"/>
+      <w:r>
+        <w:t>^{</w:t>
+      </w:r>
+      <w:proofErr w:type="spellStart"/>
+      <w:r>
+        <w:t>target</w:t>
+      </w:r>
+      <w:proofErr w:type="spellEnd"/>
+      <w:r>
+        <w:t>}_{</w:t>
+      </w:r>
+      <w:proofErr w:type="spellStart"/>
+      <w:r>
+        <w:t>i,j</w:t>
+      </w:r>
+      <w:proofErr w:type="spellEnd"/>
+      <w:r>
+        <w:t>}</w:t>
+      </w:r>
+      <w:proofErr w:type="spellStart"/>
+      <w:r>
+        <w:t>xi,jtarget</w:t>
+      </w:r>
+      <w:proofErr w:type="spellEnd"/>
+      <w:r>
+        <w:t>​ als Mittelwert der entsprechenden Werte aus den Reihen 8–16 definiert ist. Die Aggregation dieser Differenzen über alle Sätze ergibt einen mittleren Änderungsvektor</w:t>
+      </w:r>
+    </w:p>
+    <w:p>
+      <w:proofErr w:type="spellStart"/>
+      <w:r>
+        <w:t>Δˉj</w:t>
+      </w:r>
+      <w:proofErr w:type="spellEnd"/>
+      <w:r>
+        <w:t>=1n∑i=1nΔi,j\bar{\Delta}_j = \</w:t>
+      </w:r>
+      <w:proofErr w:type="spellStart"/>
+      <w:r>
+        <w:t>frac</w:t>
+      </w:r>
+      <w:proofErr w:type="spellEnd"/>
+      <w:r>
+        <w:t>{1}{n} \</w:t>
+      </w:r>
+      <w:proofErr w:type="spellStart"/>
+      <w:r>
+        <w:t>sum</w:t>
+      </w:r>
+      <w:proofErr w:type="spellEnd"/>
+      <w:r>
+        <w:t>_{i=1}^{n} \Delta_{</w:t>
+      </w:r>
+      <w:proofErr w:type="spellStart"/>
+      <w:r>
+        <w:t>i,j</w:t>
+      </w:r>
+      <w:proofErr w:type="spellEnd"/>
+      <w:r>
+        <w:t>}</w:t>
+      </w:r>
+      <w:proofErr w:type="spellStart"/>
+      <w:r>
+        <w:t>Δˉj</w:t>
+      </w:r>
+      <w:proofErr w:type="spellEnd"/>
+      <w:r>
+        <w:t>​=n1​i=1∑n​</w:t>
+      </w:r>
+      <w:proofErr w:type="spellStart"/>
+      <w:r>
+        <w:t>Δi,j</w:t>
+      </w:r>
+      <w:proofErr w:type="spellEnd"/>
+      <w:r>
+        <w:t xml:space="preserve">​ </w:t>
+      </w:r>
+    </w:p>
+    <w:p>
+      <w:r>
+        <w:t xml:space="preserve">der die systematische Drift des Modells in jeder Dimension beschreibt. Die Analyse dieses Driftvektors zeigt, dass insbesondere die Dimensionen </w:t>
+      </w:r>
+      <w:r>
+        <w:rPr>
+          <w:i/>
+          <w:iCs/>
+        </w:rPr>
+        <w:t>Sozial</w:t>
+      </w:r>
+      <w:r>
+        <w:t xml:space="preserve">, </w:t>
+      </w:r>
+      <w:r>
+        <w:rPr>
+          <w:i/>
+          <w:iCs/>
+        </w:rPr>
+        <w:t>Motivation</w:t>
+      </w:r>
+      <w:r>
+        <w:t xml:space="preserve">, </w:t>
+      </w:r>
+      <w:r>
+        <w:rPr>
+          <w:i/>
+          <w:iCs/>
+        </w:rPr>
+        <w:t>Methodik</w:t>
+      </w:r>
+      <w:r>
+        <w:t xml:space="preserve">, </w:t>
+      </w:r>
+      <w:r>
+        <w:rPr>
+          <w:i/>
+          <w:iCs/>
+        </w:rPr>
+        <w:t>Performanz</w:t>
+      </w:r>
+      <w:r>
+        <w:t xml:space="preserve"> und </w:t>
+      </w:r>
+      <w:r>
+        <w:rPr>
+          <w:i/>
+          <w:iCs/>
+        </w:rPr>
+        <w:t>Regulation</w:t>
+      </w:r>
+      <w:r>
+        <w:t xml:space="preserve"> im Ausgangssystem deutlich unterrepräsentiert sind, während die affektive Dimension tendenziell übergewichtet ist.</w:t>
+      </w:r>
+    </w:p>
+    <w:p>
+      <w:r>
+        <w:t>Aus dieser Beobachtung folgt, dass eine konsistente Kalibrierung nicht durch lokale Anpassungen einzelner Funktionsklassen erfolgen kann, sondern eine simultane Transformation des gesamten Funktionsklassenraums erfordert. Formal wird dies als dimensionsweise Diagonalskalierung der Funktionsklassenvektoren beschrieben:</w:t>
+      </w:r>
+    </w:p>
+    <w:p>
+      <w:proofErr w:type="spellStart"/>
+      <w:r>
+        <w:t>Wneu</w:t>
+      </w:r>
+      <w:proofErr w:type="spellEnd"/>
+      <w:r>
+        <w:t>=</w:t>
+      </w:r>
+      <w:proofErr w:type="spellStart"/>
+      <w:r>
+        <w:t>Walt</w:t>
+      </w:r>
+      <w:r>
+        <w:rPr>
+          <w:rFonts w:ascii="Cambria Math" w:hAnsi="Cambria Math" w:cs="Cambria Math"/>
+        </w:rPr>
+        <w:t>⋅</w:t>
+      </w:r>
+      <w:r>
+        <w:t>D</w:t>
+      </w:r>
+      <w:proofErr w:type="spellEnd"/>
+      <w:r>
+        <w:t>\</w:t>
+      </w:r>
+      <w:proofErr w:type="spellStart"/>
+      <w:r>
+        <w:t>mathbf</w:t>
+      </w:r>
+      <w:proofErr w:type="spellEnd"/>
+      <w:r>
+        <w:t>{W}_{neu} = \</w:t>
+      </w:r>
+      <w:proofErr w:type="spellStart"/>
+      <w:r>
+        <w:t>mathbf</w:t>
+      </w:r>
+      <w:proofErr w:type="spellEnd"/>
+      <w:r>
+        <w:t>{W}_{alt} \</w:t>
+      </w:r>
+      <w:proofErr w:type="spellStart"/>
+      <w:r>
+        <w:t>cdot</w:t>
+      </w:r>
+      <w:proofErr w:type="spellEnd"/>
+      <w:r>
+        <w:t xml:space="preserve"> \</w:t>
+      </w:r>
+      <w:proofErr w:type="spellStart"/>
+      <w:r>
+        <w:t>mathbf</w:t>
+      </w:r>
+      <w:proofErr w:type="spellEnd"/>
+      <w:r>
+        <w:t>{D}</w:t>
+      </w:r>
+      <w:proofErr w:type="spellStart"/>
+      <w:r>
+        <w:t>Wneu</w:t>
+      </w:r>
+      <w:proofErr w:type="spellEnd"/>
+      <w:r>
+        <w:t>​=Walt​</w:t>
+      </w:r>
+      <w:r>
+        <w:rPr>
+          <w:rFonts w:ascii="Cambria Math" w:hAnsi="Cambria Math" w:cs="Cambria Math"/>
+        </w:rPr>
+        <w:t>⋅</w:t>
+      </w:r>
+      <w:r>
+        <w:t xml:space="preserve">D </w:t>
+      </w:r>
+    </w:p>
+    <w:p>
+      <w:r>
+        <w:t>wobei D\</w:t>
+      </w:r>
+      <w:proofErr w:type="spellStart"/>
+      <w:r>
+        <w:t>mathbf</w:t>
+      </w:r>
+      <w:proofErr w:type="spellEnd"/>
+      <w:r>
+        <w:t xml:space="preserve">{D}D eine Diagonalmatrix ist, deren Einträge durch die empirisch bestimmten Skalierungsfaktoren der jeweiligen Dimensionen gegeben sind. Für jede Funktionsklasse </w:t>
+      </w:r>
+      <w:proofErr w:type="spellStart"/>
+      <w:r>
+        <w:t>kkk</w:t>
+      </w:r>
+      <w:proofErr w:type="spellEnd"/>
+      <w:r>
+        <w:t xml:space="preserve"> ergibt sich damit:</w:t>
+      </w:r>
+    </w:p>
+    <w:p>
+      <w:proofErr w:type="spellStart"/>
+      <w:r>
+        <w:t>wk,j</w:t>
+      </w:r>
+      <w:proofErr w:type="spellEnd"/>
+      <w:r>
+        <w:t>′=</w:t>
+      </w:r>
+      <w:proofErr w:type="spellStart"/>
+      <w:r>
+        <w:t>wk,j</w:t>
+      </w:r>
+      <w:r>
+        <w:rPr>
+          <w:rFonts w:ascii="Cambria Math" w:hAnsi="Cambria Math" w:cs="Cambria Math"/>
+        </w:rPr>
+        <w:t>⋅</w:t>
+      </w:r>
+      <w:r>
+        <w:t>sjw</w:t>
+      </w:r>
+      <w:proofErr w:type="spellEnd"/>
+      <w:r>
+        <w:t>'_{</w:t>
+      </w:r>
+      <w:proofErr w:type="spellStart"/>
+      <w:r>
+        <w:t>k,j</w:t>
+      </w:r>
+      <w:proofErr w:type="spellEnd"/>
+      <w:r>
+        <w:t>} = w_{</w:t>
+      </w:r>
+      <w:proofErr w:type="spellStart"/>
+      <w:r>
+        <w:t>k,j</w:t>
+      </w:r>
+      <w:proofErr w:type="spellEnd"/>
+      <w:r>
+        <w:t>} \</w:t>
+      </w:r>
+      <w:proofErr w:type="spellStart"/>
+      <w:r>
+        <w:t>cdot</w:t>
+      </w:r>
+      <w:proofErr w:type="spellEnd"/>
+      <w:r>
+        <w:t xml:space="preserve"> </w:t>
+      </w:r>
+      <w:proofErr w:type="spellStart"/>
+      <w:r>
+        <w:t>s_jwk,j</w:t>
+      </w:r>
+      <w:proofErr w:type="spellEnd"/>
+      <w:r>
+        <w:t>′​=</w:t>
+      </w:r>
+      <w:proofErr w:type="spellStart"/>
+      <w:r>
+        <w:t>wk,j</w:t>
+      </w:r>
+      <w:proofErr w:type="spellEnd"/>
+      <w:r>
+        <w:t>​</w:t>
+      </w:r>
+      <w:r>
+        <w:rPr>
+          <w:rFonts w:ascii="Cambria Math" w:hAnsi="Cambria Math" w:cs="Cambria Math"/>
+        </w:rPr>
+        <w:t>⋅</w:t>
+      </w:r>
+      <w:proofErr w:type="spellStart"/>
+      <w:r>
+        <w:t>sj</w:t>
+      </w:r>
+      <w:proofErr w:type="spellEnd"/>
+      <w:r>
+        <w:t xml:space="preserve">​ </w:t>
+      </w:r>
+    </w:p>
+    <w:p>
+      <w:r>
+        <w:t>Um Sättigungseffekte an den Gewichtungsgrenzen [−1,1][-1,1][−1,1] zu vermeiden und die Stabilität der relationalen Struktur zu erhalten, wurde diese Transformation in gedämpfter Form realisiert:</w:t>
+      </w:r>
+    </w:p>
+    <w:p>
+      <w:proofErr w:type="spellStart"/>
+      <w:r>
+        <w:t>wk,j</w:t>
+      </w:r>
+      <w:proofErr w:type="spellEnd"/>
+      <w:r>
+        <w:t>′=</w:t>
+      </w:r>
+      <w:proofErr w:type="spellStart"/>
+      <w:r>
+        <w:t>clip</w:t>
+      </w:r>
+      <w:proofErr w:type="spellEnd"/>
+      <w:r>
+        <w:rPr>
+          <w:rFonts w:ascii="Cambria Math" w:hAnsi="Cambria Math" w:cs="Cambria Math"/>
+        </w:rPr>
+        <w:t>⁡</w:t>
+      </w:r>
+      <w:r>
+        <w:t>(</w:t>
+      </w:r>
+      <w:proofErr w:type="spellStart"/>
+      <w:r>
+        <w:t>wk,j</w:t>
+      </w:r>
+      <w:proofErr w:type="spellEnd"/>
+      <w:r>
+        <w:rPr>
+          <w:rFonts w:ascii="Cambria Math" w:hAnsi="Cambria Math" w:cs="Cambria Math"/>
+        </w:rPr>
+        <w:t>⋅</w:t>
+      </w:r>
+      <w:r>
+        <w:t>(1+</w:t>
+      </w:r>
+      <w:r>
+        <w:rPr>
+          <w:rFonts w:cs="Calibri"/>
+        </w:rPr>
+        <w:t>η</w:t>
+      </w:r>
+      <w:r>
+        <w:t>(sj</w:t>
+      </w:r>
+      <w:r>
+        <w:rPr>
+          <w:rFonts w:cs="Calibri"/>
+        </w:rPr>
+        <w:t>−</w:t>
+      </w:r>
+      <w:r>
+        <w:t>1)),</w:t>
+      </w:r>
+      <w:r>
+        <w:rPr>
+          <w:rFonts w:cs="Calibri"/>
+        </w:rPr>
+        <w:t>−</w:t>
+      </w:r>
+      <w:r>
+        <w:t>1,1)w'_{</w:t>
+      </w:r>
+      <w:proofErr w:type="spellStart"/>
+      <w:r>
+        <w:t>k,j</w:t>
+      </w:r>
+      <w:proofErr w:type="spellEnd"/>
+      <w:r>
+        <w:t>} = \</w:t>
+      </w:r>
+      <w:proofErr w:type="spellStart"/>
+      <w:r>
+        <w:t>operatorname</w:t>
+      </w:r>
+      <w:proofErr w:type="spellEnd"/>
+      <w:r>
+        <w:t>{</w:t>
+      </w:r>
+      <w:proofErr w:type="spellStart"/>
+      <w:r>
+        <w:t>clip</w:t>
+      </w:r>
+      <w:proofErr w:type="spellEnd"/>
+      <w:r>
+        <w:t>}\</w:t>
+      </w:r>
+      <w:proofErr w:type="spellStart"/>
+      <w:r>
+        <w:t>bigl</w:t>
+      </w:r>
+      <w:proofErr w:type="spellEnd"/>
+      <w:r>
+        <w:t>(w_{</w:t>
+      </w:r>
+      <w:proofErr w:type="spellStart"/>
+      <w:r>
+        <w:t>k,j</w:t>
+      </w:r>
+      <w:proofErr w:type="spellEnd"/>
+      <w:r>
+        <w:t>} \</w:t>
+      </w:r>
+      <w:proofErr w:type="spellStart"/>
+      <w:r>
+        <w:t>cdot</w:t>
+      </w:r>
+      <w:proofErr w:type="spellEnd"/>
+      <w:r>
+        <w:t xml:space="preserve"> (1 + \</w:t>
+      </w:r>
+      <w:proofErr w:type="spellStart"/>
+      <w:r>
+        <w:t>eta</w:t>
+      </w:r>
+      <w:proofErr w:type="spellEnd"/>
+      <w:r>
+        <w:t xml:space="preserve"> (</w:t>
+      </w:r>
+      <w:proofErr w:type="spellStart"/>
+      <w:r>
+        <w:t>s_j</w:t>
+      </w:r>
+      <w:proofErr w:type="spellEnd"/>
+      <w:r>
+        <w:t xml:space="preserve"> - 1)), -1, 1 \</w:t>
+      </w:r>
+      <w:proofErr w:type="spellStart"/>
+      <w:r>
+        <w:t>bigr</w:t>
+      </w:r>
+      <w:proofErr w:type="spellEnd"/>
+      <w:r>
+        <w:t>)</w:t>
+      </w:r>
+      <w:proofErr w:type="spellStart"/>
+      <w:r>
+        <w:t>wk,j</w:t>
+      </w:r>
+      <w:proofErr w:type="spellEnd"/>
+      <w:r>
+        <w:t>′​=</w:t>
+      </w:r>
+      <w:proofErr w:type="spellStart"/>
+      <w:r>
+        <w:t>clip</w:t>
+      </w:r>
+      <w:proofErr w:type="spellEnd"/>
+      <w:r>
+        <w:t>(</w:t>
+      </w:r>
+      <w:proofErr w:type="spellStart"/>
+      <w:r>
+        <w:t>wk,j</w:t>
+      </w:r>
+      <w:proofErr w:type="spellEnd"/>
+      <w:r>
+        <w:t>​</w:t>
+      </w:r>
+      <w:r>
+        <w:rPr>
+          <w:rFonts w:ascii="Cambria Math" w:hAnsi="Cambria Math" w:cs="Cambria Math"/>
+        </w:rPr>
+        <w:t>⋅</w:t>
+      </w:r>
+      <w:r>
+        <w:t>(1+η(</w:t>
+      </w:r>
+      <w:proofErr w:type="spellStart"/>
+      <w:r>
+        <w:t>sj</w:t>
+      </w:r>
+      <w:proofErr w:type="spellEnd"/>
+      <w:r>
+        <w:t xml:space="preserve">​−1)),−1,1) </w:t>
+      </w:r>
+    </w:p>
+    <w:p>
+      <w:r>
+        <w:t>mit einem Dämpfungsparameter 0&lt;η≤10 &lt; \</w:t>
+      </w:r>
+      <w:proofErr w:type="spellStart"/>
+      <w:r>
+        <w:t>eta</w:t>
+      </w:r>
+      <w:proofErr w:type="spellEnd"/>
+      <w:r>
+        <w:t xml:space="preserve"> \</w:t>
+      </w:r>
+      <w:proofErr w:type="spellStart"/>
+      <w:r>
+        <w:t>leq</w:t>
+      </w:r>
+      <w:proofErr w:type="spellEnd"/>
+      <w:r>
+        <w:t xml:space="preserve"> 10&lt;η≤1. In der praktischen Umsetzung wurde η=0,5\</w:t>
+      </w:r>
+      <w:proofErr w:type="spellStart"/>
+      <w:r>
+        <w:t>eta</w:t>
+      </w:r>
+      <w:proofErr w:type="spellEnd"/>
+      <w:r>
+        <w:t xml:space="preserve"> = 0{,}5η=0,5 gewählt, sodass die Anpassung proportional zur beobachteten Änderungsrate erfolgt, ohne die bestehenden Relationen zwischen den Funktionsklassen zu zerstören.</w:t>
+      </w:r>
+    </w:p>
+    <w:p>
+      <w:r>
+        <w:t>Zur Gewährleistung der methodischen Konsistenz wurde vor der Anwendung dieser Transformation der ursprüngliche Ausgangszustand der Funktionsklassen wiederhergestellt. Dadurch wird sichergestellt, dass die Kalibrierung ausschließlich auf der Differenz zwischen der unveränderten Systemausgabe (Reihe 1) und dem Referenzfeld basiert. Eine direkte Weiterverarbeitung bereits transformierter Gewichte würde zu kumulativen Verzerrungen führen und die Validität der Kalibrierung beeinträchtigen.</w:t>
+      </w:r>
+    </w:p>
+    <w:p>
+      <w:r>
+        <w:lastRenderedPageBreak/>
+        <w:t>Die Kalibrierung wird damit von einer lokalen Parameteranpassung zu einer globalen Transformation des semantischen Funktionsraums erweitert. Diese Transformation wirkt nicht auf einzelne Klassen isoliert, sondern auf die Struktur des gesamten Systems und stellt somit den ersten konsistenten Schritt einer funktionalen Validierung im Sinne des FRZK dar.</w:t>
+      </w:r>
+    </w:p>
+    <w:p/>
+    <w:p>
+      <w:r>
         <w:pict w14:anchorId="47B03084">
           <v:rect id="_x0000_i1027" style="width:0;height:1.5pt" o:hralign="center" o:hrstd="t" o:hr="t" fillcolor="#a0a0a0" stroked="f"/>
         </w:pict>
@@ -799,6 +1455,7 @@
           </w:tcPr>
           <w:p>
             <w:r>
+              <w:lastRenderedPageBreak/>
               <w:t>Verbesserte Sätze (Distanz)</w:t>
             </w:r>
           </w:p>
@@ -960,7 +1617,6 @@
         </w:numPr>
       </w:pPr>
       <w:r>
-        <w:lastRenderedPageBreak/>
         <w:t xml:space="preserve">eine </w:t>
       </w:r>
       <w:r>
@@ -1255,6 +1911,7 @@
     </w:p>
     <w:p>
       <w:r>
+        <w:lastRenderedPageBreak/>
         <w:pict w14:anchorId="4F0AE463">
           <v:rect id="_x0000_i1032" style="width:0;height:1.5pt" o:hralign="center" o:hrstd="t" o:hr="t" fillcolor="#a0a0a0" stroked="f"/>
         </w:pict>
@@ -1338,7 +1995,6 @@
           <w:b/>
           <w:bCs/>
         </w:rPr>
-        <w:lastRenderedPageBreak/>
         <w:t>Erhöhte Anschlussfähigkeit</w:t>
       </w:r>
       <w:r>
@@ -1578,6 +2234,7 @@
     </w:p>
     <w:p>
       <w:r>
+        <w:lastRenderedPageBreak/>
         <w:t xml:space="preserve">Im folgenden Abschnitt (Kapitel 5.5) wird daher die </w:t>
       </w:r>
       <w:r>

</xml_diff>